<commit_message>
Safety checkpoint before transcript cleaner work
</commit_message>
<xml_diff>
--- a/Documentation/Architecture/DocAnalyser_Roadmap_Review_Feb2026.docx
+++ b/Documentation/Architecture/DocAnalyser_Roadmap_Review_Feb2026.docx
@@ -136,7 +136,7 @@
           <w:sz w:val="22"/>
           <w:szCs w:val="22"/>
         </w:rPr>
-        <w:t xml:space="preserve">The v2.0 roadmap planned 11 enhancements across 5 phases. Since the roadmap was written, substantial development has taken place. Of the 11 original enhancements, 5 are fully implemented, 1 is partially implemented, and 5 remain outstanding. A 12th enhancement (Provider &amp; Model Maintenance) has been identified and added during this review. Additionally, several significant features have been built that were not anticipated in the roadmap. The original phasing is now largely obsolete — Phases 1–3 are effectively complete — and the remaining items need re-prioritisation against the current state of the app and the competitive landscape.</w:t>
+        <w:t xml:space="preserve">The v2.0 roadmap planned 11 enhancements across 5 phases. Since the roadmap was written, substantial development has taken place. Of the 11 original enhancements, 5 are fully implemented, 1 is partially implemented, and 5 remain outstanding. A 12th enhancement (Provider &amp; Model Maintenance), a 13th (Workspaces), and a 14th through 20th (developer maintenance tooling and code quality) have been identified and added during review. Additionally, several significant features have been built that were not anticipated in the roadmap, including a complete migration from JSON file storage to SQLite database. The original phasing is now largely obsolete — Phases 1–3 are effectively complete — and the remaining items need re-prioritisation against the current state of the app and the competitive landscape.</w:t>
       </w:r>
     </w:p>
     <w:p>
@@ -245,7 +245,7 @@
           <w:sz w:val="22"/>
           <w:szCs w:val="22"/>
         </w:rPr>
-        <w:t xml:space="preserve">Still valuable as a relatively quick win.</w:t>
+        <w:t xml:space="preserve">Still valuable as a relatively quick win. Scope has since been expanded: the design now uses a self-contained .docanalyser package format (ZIP with manifest.json) covering both prompts and documents, with export by folder/selection/all and an import dialog with destination picker. The InnoSetup installer should register the .docanalyser file extension so double-clicking opens the import dialog directly.</w:t>
       </w:r>
     </w:p>
     <w:p>
@@ -992,6 +992,678 @@
           <w:szCs w:val="22"/>
         </w:rPr>
         <w:t xml:space="preserve">Proceed with both 12a and 12b, but not as an immediate priority. Slot into Phase B.</w:t>
+      </w:r>
+    </w:p>
+    <w:p>
+      <w:pPr>
+        <w:pStyle w:val="Heading2"/>
+        <w:spacing w:before="300" w:after="100"/>
+      </w:pPr>
+      <w:r>
+        <w:rPr>
+          <w:rFonts w:ascii="Arial" w:cs="Arial" w:eastAsia="Arial" w:hAnsi="Arial"/>
+          <w:b/>
+          <w:bCs/>
+          <w:sz w:val="26"/>
+          <w:szCs w:val="26"/>
+        </w:rPr>
+        <w:t xml:space="preserve">Enhancement 13: Workspaces (NEW)</w:t>
+      </w:r>
+    </w:p>
+    <w:p>
+      <w:pPr>
+        <w:spacing w:after="120"/>
+      </w:pPr>
+      <w:r>
+        <w:rPr>
+          <w:rFonts w:ascii="Arial" w:cs="Arial" w:eastAsia="Arial" w:hAnsi="Arial"/>
+          <w:b/>
+          <w:bCs/>
+          <w:sz w:val="22"/>
+          <w:szCs w:val="22"/>
+        </w:rPr>
+        <w:t xml:space="preserve">Status: </w:t>
+      </w:r>
+      <w:r>
+        <w:rPr>
+          <w:rFonts w:ascii="Arial" w:cs="Arial" w:eastAsia="Arial" w:hAnsi="Arial"/>
+          <w:b/>
+          <w:bCs/>
+          <w:color w:val="666666"/>
+          <w:sz w:val="22"/>
+          <w:szCs w:val="22"/>
+        </w:rPr>
+        <w:t xml:space="preserve">Planned (foundation in place)</w:t>
+      </w:r>
+    </w:p>
+    <w:p>
+      <w:pPr>
+        <w:spacing w:after="120"/>
+      </w:pPr>
+      <w:r>
+        <w:rPr>
+          <w:rFonts w:ascii="Arial" w:cs="Arial" w:eastAsia="Arial" w:hAnsi="Arial"/>
+          <w:sz w:val="22"/>
+          <w:szCs w:val="22"/>
+        </w:rPr>
+        <w:t xml:space="preserve">Workspaces would allow users to partition their documents, conversations, prompts, costs, and folder structures into separate project spaces. When working “in” a workspace, only that workspace’s content is visible. This addresses the growing problem of unrelated research topics cluttering a single flat library.</w:t>
+      </w:r>
+    </w:p>
+    <w:p>
+      <w:pPr>
+        <w:spacing w:after="120"/>
+      </w:pPr>
+      <w:r>
+        <w:rPr>
+          <w:rFonts w:ascii="Arial" w:cs="Arial" w:eastAsia="Arial" w:hAnsi="Arial"/>
+          <w:sz w:val="22"/>
+          <w:szCs w:val="22"/>
+        </w:rPr>
+        <w:t xml:space="preserve">The SQLite migration (March 2026) pre-wired workspace_id columns into the folders and cost_log tables. The documents and prompts tables still need workspace_id columns added. A new workspaces table is required (id, name, created_at, description).</w:t>
+      </w:r>
+    </w:p>
+    <w:p>
+      <w:pPr>
+        <w:spacing w:after="120"/>
+      </w:pPr>
+      <w:r>
+        <w:rPr>
+          <w:rFonts w:ascii="Arial" w:cs="Arial" w:eastAsia="Arial" w:hAnsi="Arial"/>
+          <w:sz w:val="22"/>
+          <w:szCs w:val="22"/>
+        </w:rPr>
+        <w:t xml:space="preserve">Key design decisions already made: Prompts default to global (visible in all workspaces) but can optionally be scoped to specific workspaces. A many-to-many junction table (prompt_workspaces) allows a single prompt to be exposed in multiple workspaces without duplication. The same pattern applies to documents, which may be relevant to more than one project. Implementation requires: a workspaces table, workspace_id on documents, a prompt_workspaces junction table, a document_workspaces junction table, UI for creating/switching workspaces, and filtering throughout the app.</w:t>
+      </w:r>
+    </w:p>
+    <w:p>
+      <w:pPr>
+        <w:spacing w:after="120"/>
+      </w:pPr>
+      <w:r>
+        <w:rPr>
+          <w:rFonts w:ascii="Arial" w:cs="Arial" w:eastAsia="Arial" w:hAnsi="Arial"/>
+          <w:i/>
+          <w:iCs/>
+          <w:color w:val="666666"/>
+          <w:sz w:val="22"/>
+          <w:szCs w:val="22"/>
+        </w:rPr>
+        <w:t xml:space="preserve">Moderate effort. The SQLite foundation makes this feasible; the main work is the UI and filtering logic. Slot into Phase B or C depending on user demand.</w:t>
+      </w:r>
+    </w:p>
+    <w:p>
+      <w:pPr>
+        <w:pStyle w:val="Heading2"/>
+        <w:spacing w:before="300" w:after="100"/>
+      </w:pPr>
+      <w:r>
+        <w:rPr>
+          <w:rFonts w:ascii="Arial" w:cs="Arial" w:eastAsia="Arial" w:hAnsi="Arial"/>
+          <w:b/>
+          <w:bCs/>
+          <w:sz w:val="26"/>
+          <w:szCs w:val="26"/>
+        </w:rPr>
+        <w:t xml:space="preserve">Enhancement 14: Help Text Editor (NEW)</w:t>
+      </w:r>
+    </w:p>
+    <w:p>
+      <w:pPr>
+        <w:spacing w:after="120"/>
+      </w:pPr>
+      <w:r>
+        <w:rPr>
+          <w:rFonts w:ascii="Arial" w:cs="Arial" w:eastAsia="Arial" w:hAnsi="Arial"/>
+          <w:b/>
+          <w:bCs/>
+          <w:sz w:val="22"/>
+          <w:szCs w:val="22"/>
+        </w:rPr>
+        <w:t xml:space="preserve">Status: </w:t>
+      </w:r>
+      <w:r>
+        <w:rPr>
+          <w:rFonts w:ascii="Arial" w:cs="Arial" w:eastAsia="Arial" w:hAnsi="Arial"/>
+          <w:b/>
+          <w:bCs/>
+          <w:color w:val="666666"/>
+          <w:sz w:val="22"/>
+          <w:szCs w:val="22"/>
+        </w:rPr>
+        <w:t xml:space="preserve">Planned</w:t>
+      </w:r>
+    </w:p>
+    <w:p>
+      <w:pPr>
+        <w:spacing w:after="120"/>
+      </w:pPr>
+      <w:r>
+        <w:rPr>
+          <w:rFonts w:ascii="Arial" w:cs="Arial" w:eastAsia="Arial" w:hAnsi="Arial"/>
+          <w:sz w:val="22"/>
+          <w:szCs w:val="22"/>
+        </w:rPr>
+        <w:t xml:space="preserve">The context-sensitive help system currently stores all help texts in help_texts.json. Editing this file manually is tedious and error-prone — escaped newlines, nested JSON strings, and no way to preview the result without restarting the app.</w:t>
+      </w:r>
+    </w:p>
+    <w:p>
+      <w:pPr>
+        <w:spacing w:after="120"/>
+      </w:pPr>
+      <w:r>
+        <w:rPr>
+          <w:rFonts w:ascii="Arial" w:cs="Arial" w:eastAsia="Arial" w:hAnsi="Arial"/>
+          <w:sz w:val="22"/>
+          <w:szCs w:val="22"/>
+        </w:rPr>
+        <w:t xml:space="preserve">The proposed solution has two parts: (a) migrate help texts to a help_texts table in the SQLite database, with columns for key, title, description, and tips (stored as JSON array); and (b) build a standalone maintenance tool (maintenance/help_text_editor.py) providing a Tkinter Treeview table of all entries, with an edit form below for title, description (multi-line text area), and tips. The editor would include Add, Edit, Delete, and Preview buttons — where Preview pops up the help popup exactly as the user would see it, allowing formatting checks without restarting the app.</w:t>
+      </w:r>
+    </w:p>
+    <w:p>
+      <w:pPr>
+        <w:spacing w:after="120"/>
+      </w:pPr>
+      <w:r>
+        <w:rPr>
+          <w:rFonts w:ascii="Arial" w:cs="Arial" w:eastAsia="Arial" w:hAnsi="Arial"/>
+          <w:sz w:val="22"/>
+          <w:szCs w:val="22"/>
+        </w:rPr>
+        <w:t xml:space="preserve">The context_help.py module would load from SQLite at startup, falling back to help_texts.json if the table is empty (first run or fresh install). The JSON file can still be generated as a one-time export for distribution with the installer. The maintenance tool lives in the project’s maintenance subfolder, accessible to the developer only.</w:t>
+      </w:r>
+    </w:p>
+    <w:p>
+      <w:pPr>
+        <w:spacing w:after="120"/>
+      </w:pPr>
+      <w:r>
+        <w:rPr>
+          <w:rFonts w:ascii="Arial" w:cs="Arial" w:eastAsia="Arial" w:hAnsi="Arial"/>
+          <w:i/>
+          <w:iCs/>
+          <w:color w:val="666666"/>
+          <w:sz w:val="22"/>
+          <w:szCs w:val="22"/>
+        </w:rPr>
+        <w:t xml:space="preserve">Low-to-moderate effort. Developer quality-of-life improvement. Slot into Phase A as a quick win.</w:t>
+      </w:r>
+    </w:p>
+    <w:p>
+      <w:pPr>
+        <w:pStyle w:val="Heading2"/>
+        <w:spacing w:before="300" w:after="100"/>
+      </w:pPr>
+      <w:r>
+        <w:rPr>
+          <w:rFonts w:ascii="Arial" w:cs="Arial" w:eastAsia="Arial" w:hAnsi="Arial"/>
+          <w:b/>
+          <w:bCs/>
+          <w:sz w:val="26"/>
+          <w:szCs w:val="26"/>
+        </w:rPr>
+        <w:t xml:space="preserve">Enhancement 15: User-Facing Message Editor (NEW)</w:t>
+      </w:r>
+    </w:p>
+    <w:p>
+      <w:pPr>
+        <w:spacing w:after="120"/>
+      </w:pPr>
+      <w:r>
+        <w:rPr>
+          <w:rFonts w:ascii="Arial" w:cs="Arial" w:eastAsia="Arial" w:hAnsi="Arial"/>
+          <w:b/>
+          <w:bCs/>
+          <w:sz w:val="22"/>
+          <w:szCs w:val="22"/>
+        </w:rPr>
+        <w:t xml:space="preserve">Status: </w:t>
+      </w:r>
+      <w:r>
+        <w:rPr>
+          <w:rFonts w:ascii="Arial" w:cs="Arial" w:eastAsia="Arial" w:hAnsi="Arial"/>
+          <w:b/>
+          <w:bCs/>
+          <w:color w:val="666666"/>
+          <w:sz w:val="22"/>
+          <w:szCs w:val="22"/>
+        </w:rPr>
+        <w:t xml:space="preserve">Planned</w:t>
+      </w:r>
+    </w:p>
+    <w:p>
+      <w:pPr>
+        <w:spacing w:after="120"/>
+      </w:pPr>
+      <w:r>
+        <w:rPr>
+          <w:rFonts w:ascii="Arial" w:cs="Arial" w:eastAsia="Arial" w:hAnsi="Arial"/>
+          <w:sz w:val="22"/>
+          <w:szCs w:val="22"/>
+        </w:rPr>
+        <w:t xml:space="preserve">Error messages, warnings, confirmations, and other user-facing dialog strings are currently hardcoded throughout 30+ source files. When a beta tester reports that a message is confusing or insufficiently informative, finding and changing it requires searching through the codebase. This is slow and error-prone.</w:t>
+      </w:r>
+    </w:p>
+    <w:p>
+      <w:pPr>
+        <w:spacing w:after="120"/>
+      </w:pPr>
+      <w:r>
+        <w:rPr>
+          <w:rFonts w:ascii="Arial" w:cs="Arial" w:eastAsia="Arial" w:hAnsi="Arial"/>
+          <w:sz w:val="22"/>
+          <w:szCs w:val="22"/>
+        </w:rPr>
+        <w:t xml:space="preserve">The proposed solution centralises all user-facing messages into a messages.json file (and eventually a SQLite table), keyed by message ID, with each entry containing the text, a category (error, warning, info, confirmation), and a note about which module uses it. Code would call get_message(“ai_connection_failed”) instead of embedding the string directly. A maintenance tool — sharing the same UI as the Help Text Editor (Enhancement 14), as a second tab — provides a searchable, filterable table of all messages with edit-in-place and a “Where Used” column showing the source module.</w:t>
+      </w:r>
+    </w:p>
+    <w:p>
+      <w:pPr>
+        <w:spacing w:after="120"/>
+      </w:pPr>
+      <w:r>
+        <w:rPr>
+          <w:rFonts w:ascii="Arial" w:cs="Arial" w:eastAsia="Arial" w:hAnsi="Arial"/>
+          <w:sz w:val="22"/>
+          <w:szCs w:val="22"/>
+        </w:rPr>
+        <w:t xml:space="preserve">The main cost is the initial migration — extracting every messagebox, status_var.set(), and inline string. This is tedious but mechanical and can be done incrementally, starting with the most common error dialogs and expanding over time.</w:t>
+      </w:r>
+    </w:p>
+    <w:p>
+      <w:pPr>
+        <w:spacing w:after="120"/>
+      </w:pPr>
+      <w:r>
+        <w:rPr>
+          <w:rFonts w:ascii="Arial" w:cs="Arial" w:eastAsia="Arial" w:hAnsi="Arial"/>
+          <w:i/>
+          <w:iCs/>
+          <w:color w:val="666666"/>
+          <w:sz w:val="22"/>
+          <w:szCs w:val="22"/>
+        </w:rPr>
+        <w:t xml:space="preserve">Moderate effort (migration is incremental). Particularly valuable during beta. Slot into Phase A alongside Enhancement 14.</w:t>
+      </w:r>
+    </w:p>
+    <w:p>
+      <w:pPr>
+        <w:pStyle w:val="Heading2"/>
+        <w:spacing w:before="300" w:after="100"/>
+      </w:pPr>
+      <w:r>
+        <w:rPr>
+          <w:rFonts w:ascii="Arial" w:cs="Arial" w:eastAsia="Arial" w:hAnsi="Arial"/>
+          <w:b/>
+          <w:bCs/>
+          <w:sz w:val="26"/>
+          <w:szCs w:val="26"/>
+        </w:rPr>
+        <w:t xml:space="preserve">Enhancement 16: Settings Registry (NEW)</w:t>
+      </w:r>
+    </w:p>
+    <w:p>
+      <w:pPr>
+        <w:spacing w:after="120"/>
+      </w:pPr>
+      <w:r>
+        <w:rPr>
+          <w:rFonts w:ascii="Arial" w:cs="Arial" w:eastAsia="Arial" w:hAnsi="Arial"/>
+          <w:b/>
+          <w:bCs/>
+          <w:sz w:val="22"/>
+          <w:szCs w:val="22"/>
+        </w:rPr>
+        <w:t xml:space="preserve">Status: </w:t>
+      </w:r>
+      <w:r>
+        <w:rPr>
+          <w:rFonts w:ascii="Arial" w:cs="Arial" w:eastAsia="Arial" w:hAnsi="Arial"/>
+          <w:b/>
+          <w:bCs/>
+          <w:color w:val="666666"/>
+          <w:sz w:val="22"/>
+          <w:szCs w:val="22"/>
+        </w:rPr>
+        <w:t xml:space="preserve">Planned</w:t>
+      </w:r>
+    </w:p>
+    <w:p>
+      <w:pPr>
+        <w:spacing w:after="120"/>
+      </w:pPr>
+      <w:r>
+        <w:rPr>
+          <w:rFonts w:ascii="Arial" w:cs="Arial" w:eastAsia="Arial" w:hAnsi="Arial"/>
+          <w:sz w:val="22"/>
+          <w:szCs w:val="22"/>
+        </w:rPr>
+        <w:t xml:space="preserve">Application settings are currently scattered across config.py, config_manager.py, settings_manager.py and various modules, with defaults defined in different places. This makes it difficult to answer basic questions: what settings exist, what are the defaults, which module reads a given setting, or whether a setting is still in use.</w:t>
+      </w:r>
+    </w:p>
+    <w:p>
+      <w:pPr>
+        <w:spacing w:after="120"/>
+      </w:pPr>
+      <w:r>
+        <w:rPr>
+          <w:rFonts w:ascii="Arial" w:cs="Arial" w:eastAsia="Arial" w:hAnsi="Arial"/>
+          <w:sz w:val="22"/>
+          <w:szCs w:val="22"/>
+        </w:rPr>
+        <w:t xml:space="preserve">The proposed solution is a centralised settings table (key, default value, current value, data type, category, description, which module uses it) with a read-only maintenance viewer. Adding, renaming, or deprecating a setting would be visible in one place rather than requiring changes across multiple files. Could share the same maintenance tool as Enhancements 14 and 15 as an additional tab.</w:t>
+      </w:r>
+    </w:p>
+    <w:p>
+      <w:pPr>
+        <w:spacing w:after="120"/>
+      </w:pPr>
+      <w:r>
+        <w:rPr>
+          <w:rFonts w:ascii="Arial" w:cs="Arial" w:eastAsia="Arial" w:hAnsi="Arial"/>
+          <w:i/>
+          <w:iCs/>
+          <w:color w:val="666666"/>
+          <w:sz w:val="22"/>
+          <w:szCs w:val="22"/>
+        </w:rPr>
+        <w:t xml:space="preserve">Moderate effort. High day-to-day maintenance value. Slot into Phase A.</w:t>
+      </w:r>
+    </w:p>
+    <w:p>
+      <w:pPr>
+        <w:pStyle w:val="Heading2"/>
+        <w:spacing w:before="300" w:after="100"/>
+      </w:pPr>
+      <w:r>
+        <w:rPr>
+          <w:rFonts w:ascii="Arial" w:cs="Arial" w:eastAsia="Arial" w:hAnsi="Arial"/>
+          <w:b/>
+          <w:bCs/>
+          <w:sz w:val="26"/>
+          <w:szCs w:val="26"/>
+        </w:rPr>
+        <w:t xml:space="preserve">Enhancement 17: Module Dependency Map (NEW)</w:t>
+      </w:r>
+    </w:p>
+    <w:p>
+      <w:pPr>
+        <w:spacing w:after="120"/>
+      </w:pPr>
+      <w:r>
+        <w:rPr>
+          <w:rFonts w:ascii="Arial" w:cs="Arial" w:eastAsia="Arial" w:hAnsi="Arial"/>
+          <w:b/>
+          <w:bCs/>
+          <w:sz w:val="22"/>
+          <w:szCs w:val="22"/>
+        </w:rPr>
+        <w:t xml:space="preserve">Status: </w:t>
+      </w:r>
+      <w:r>
+        <w:rPr>
+          <w:rFonts w:ascii="Arial" w:cs="Arial" w:eastAsia="Arial" w:hAnsi="Arial"/>
+          <w:b/>
+          <w:bCs/>
+          <w:color w:val="666666"/>
+          <w:sz w:val="22"/>
+          <w:szCs w:val="22"/>
+        </w:rPr>
+        <w:t xml:space="preserve">Planned</w:t>
+      </w:r>
+    </w:p>
+    <w:p>
+      <w:pPr>
+        <w:spacing w:after="120"/>
+      </w:pPr>
+      <w:r>
+        <w:rPr>
+          <w:rFonts w:ascii="Arial" w:cs="Arial" w:eastAsia="Arial" w:hAnsi="Arial"/>
+          <w:sz w:val="22"/>
+          <w:szCs w:val="22"/>
+        </w:rPr>
+        <w:t xml:space="preserve">A standalone maintenance script (maintenance/dependency_map.py) that scans all .py files, parses their import and from-X-import statements, and produces a report showing which modules depend on which others. When changing a function signature or refactoring a module, running this tool immediately shows every module that imports from it. Essentially what PyCharm’s “Find Usages” does, but as a standalone report that can be consulted without the IDE. Could output a text report or a Mermaid diagram. Estimated at 60–80 lines of code.</w:t>
+      </w:r>
+    </w:p>
+    <w:p>
+      <w:pPr>
+        <w:spacing w:after="120"/>
+      </w:pPr>
+      <w:r>
+        <w:rPr>
+          <w:rFonts w:ascii="Arial" w:cs="Arial" w:eastAsia="Arial" w:hAnsi="Arial"/>
+          <w:i/>
+          <w:iCs/>
+          <w:color w:val="666666"/>
+          <w:sz w:val="22"/>
+          <w:szCs w:val="22"/>
+        </w:rPr>
+        <w:t xml:space="preserve">Low effort. Nice-to-have. Slot into Phase A.</w:t>
+      </w:r>
+    </w:p>
+    <w:p>
+      <w:pPr>
+        <w:pStyle w:val="Heading2"/>
+        <w:spacing w:before="300" w:after="100"/>
+      </w:pPr>
+      <w:r>
+        <w:rPr>
+          <w:rFonts w:ascii="Arial" w:cs="Arial" w:eastAsia="Arial" w:hAnsi="Arial"/>
+          <w:b/>
+          <w:bCs/>
+          <w:sz w:val="26"/>
+          <w:szCs w:val="26"/>
+        </w:rPr>
+        <w:t xml:space="preserve">Enhancement 18: Pre-Release Smoke Test (NEW)</w:t>
+      </w:r>
+    </w:p>
+    <w:p>
+      <w:pPr>
+        <w:spacing w:after="120"/>
+      </w:pPr>
+      <w:r>
+        <w:rPr>
+          <w:rFonts w:ascii="Arial" w:cs="Arial" w:eastAsia="Arial" w:hAnsi="Arial"/>
+          <w:b/>
+          <w:bCs/>
+          <w:sz w:val="22"/>
+          <w:szCs w:val="22"/>
+        </w:rPr>
+        <w:t xml:space="preserve">Status: </w:t>
+      </w:r>
+      <w:r>
+        <w:rPr>
+          <w:rFonts w:ascii="Arial" w:cs="Arial" w:eastAsia="Arial" w:hAnsi="Arial"/>
+          <w:b/>
+          <w:bCs/>
+          <w:color w:val="666666"/>
+          <w:sz w:val="22"/>
+          <w:szCs w:val="22"/>
+        </w:rPr>
+        <w:t xml:space="preserve">Planned</w:t>
+      </w:r>
+    </w:p>
+    <w:p>
+      <w:pPr>
+        <w:spacing w:after="120"/>
+      </w:pPr>
+      <w:r>
+        <w:rPr>
+          <w:rFonts w:ascii="Arial" w:cs="Arial" w:eastAsia="Arial" w:hAnsi="Arial"/>
+          <w:sz w:val="22"/>
+          <w:szCs w:val="22"/>
+        </w:rPr>
+        <w:t xml:space="preserve">A maintenance script (maintenance/smoke_test.py) that runs basic sanity checks before building the installer. Checks would include: all imports resolve (no typos in module names), all help text keys referenced in code exist in the help texts table, all message keys exist in the messages table, no duplicate function names within a module, all SQLite feature flags are set to their intended values, and version number in version.py has been incremented since the last build. Catches the kind of silly mistakes that only surface after building and distributing.</w:t>
+      </w:r>
+    </w:p>
+    <w:p>
+      <w:pPr>
+        <w:spacing w:after="120"/>
+      </w:pPr>
+      <w:r>
+        <w:rPr>
+          <w:rFonts w:ascii="Arial" w:cs="Arial" w:eastAsia="Arial" w:hAnsi="Arial"/>
+          <w:i/>
+          <w:iCs/>
+          <w:color w:val="666666"/>
+          <w:sz w:val="22"/>
+          <w:szCs w:val="22"/>
+        </w:rPr>
+        <w:t xml:space="preserve">Low effort. High value — catches errors before they reach users. Slot into Phase A. Best built after Enhancements 14 and 15 are in place so it can validate their key lookups.</w:t>
+      </w:r>
+    </w:p>
+    <w:p>
+      <w:pPr>
+        <w:pStyle w:val="Heading2"/>
+        <w:spacing w:before="300" w:after="100"/>
+      </w:pPr>
+      <w:r>
+        <w:rPr>
+          <w:rFonts w:ascii="Arial" w:cs="Arial" w:eastAsia="Arial" w:hAnsi="Arial"/>
+          <w:b/>
+          <w:bCs/>
+          <w:sz w:val="26"/>
+          <w:szCs w:val="26"/>
+        </w:rPr>
+        <w:t xml:space="preserve">Enhancement 19: Config/Constants Audit Tool (NEW)</w:t>
+      </w:r>
+    </w:p>
+    <w:p>
+      <w:pPr>
+        <w:spacing w:after="120"/>
+      </w:pPr>
+      <w:r>
+        <w:rPr>
+          <w:rFonts w:ascii="Arial" w:cs="Arial" w:eastAsia="Arial" w:hAnsi="Arial"/>
+          <w:b/>
+          <w:bCs/>
+          <w:sz w:val="22"/>
+          <w:szCs w:val="22"/>
+        </w:rPr>
+        <w:t xml:space="preserve">Status: </w:t>
+      </w:r>
+      <w:r>
+        <w:rPr>
+          <w:rFonts w:ascii="Arial" w:cs="Arial" w:eastAsia="Arial" w:hAnsi="Arial"/>
+          <w:b/>
+          <w:bCs/>
+          <w:color w:val="666666"/>
+          <w:sz w:val="22"/>
+          <w:szCs w:val="22"/>
+        </w:rPr>
+        <w:t xml:space="preserve">Planned</w:t>
+      </w:r>
+    </w:p>
+    <w:p>
+      <w:pPr>
+        <w:spacing w:after="120"/>
+      </w:pPr>
+      <w:r>
+        <w:rPr>
+          <w:rFonts w:ascii="Arial" w:cs="Arial" w:eastAsia="Arial" w:hAnsi="Arial"/>
+          <w:sz w:val="22"/>
+          <w:szCs w:val="22"/>
+        </w:rPr>
+        <w:t xml:space="preserve">A one-off scan tool (maintenance/constants_audit.py) that finds magic numbers and hardcoded paths buried in source files — things like max_versions = 10, timeout = 30, chunk_size = 4000, file paths like “cost_log.txt”. Scans all .py files for numeric literals and string literals that look like configuration (paths, URLs, sizes, limits) and reports them with their file and line number. Not automated extraction — just a report that says “here are N hardcoded values you might want to centralise.” Run occasionally as a housekeeping exercise; results feed into the Settings Registry (Enhancement 16).</w:t>
+      </w:r>
+    </w:p>
+    <w:p>
+      <w:pPr>
+        <w:spacing w:after="120"/>
+      </w:pPr>
+      <w:r>
+        <w:rPr>
+          <w:rFonts w:ascii="Arial" w:cs="Arial" w:eastAsia="Arial" w:hAnsi="Arial"/>
+          <w:i/>
+          <w:iCs/>
+          <w:color w:val="666666"/>
+          <w:sz w:val="22"/>
+          <w:szCs w:val="22"/>
+        </w:rPr>
+        <w:t xml:space="preserve">Low effort. Run as needed rather than a permanent fixture. Slot into Phase A.</w:t>
+      </w:r>
+    </w:p>
+    <w:p>
+      <w:pPr>
+        <w:pStyle w:val="Heading2"/>
+        <w:spacing w:before="300" w:after="100"/>
+      </w:pPr>
+      <w:r>
+        <w:rPr>
+          <w:rFonts w:ascii="Arial" w:cs="Arial" w:eastAsia="Arial" w:hAnsi="Arial"/>
+          <w:b/>
+          <w:bCs/>
+          <w:sz w:val="26"/>
+          <w:szCs w:val="26"/>
+        </w:rPr>
+        <w:t xml:space="preserve">Enhancement 20: Function-Level Documentation Pass (NEW)</w:t>
+      </w:r>
+    </w:p>
+    <w:p>
+      <w:pPr>
+        <w:spacing w:after="120"/>
+      </w:pPr>
+      <w:r>
+        <w:rPr>
+          <w:rFonts w:ascii="Arial" w:cs="Arial" w:eastAsia="Arial" w:hAnsi="Arial"/>
+          <w:b/>
+          <w:bCs/>
+          <w:sz w:val="22"/>
+          <w:szCs w:val="22"/>
+        </w:rPr>
+        <w:t xml:space="preserve">Status: </w:t>
+      </w:r>
+      <w:r>
+        <w:rPr>
+          <w:rFonts w:ascii="Arial" w:cs="Arial" w:eastAsia="Arial" w:hAnsi="Arial"/>
+          <w:b/>
+          <w:bCs/>
+          <w:color w:val="666666"/>
+          <w:sz w:val="22"/>
+          <w:szCs w:val="22"/>
+        </w:rPr>
+        <w:t xml:space="preserve">Planned</w:t>
+      </w:r>
+    </w:p>
+    <w:p>
+      <w:pPr>
+        <w:spacing w:after="120"/>
+      </w:pPr>
+      <w:r>
+        <w:rPr>
+          <w:rFonts w:ascii="Arial" w:cs="Arial" w:eastAsia="Arial" w:hAnsi="Arial"/>
+          <w:sz w:val="22"/>
+          <w:szCs w:val="22"/>
+        </w:rPr>
+        <w:t xml:space="preserve">The codebase has good file-level docstrings and the Project Map provides a high-level view of every module, but individual functions are often light on explanation of why rather than what. Self-explanatory functions like delete_document(doc_id) don’t need help, but non-obvious logic — things like _init_source_collapse_state(), _check_expansion_warning(), curate_models_with_ai(), or _migrate_v1_to_v2() — would benefit from concise docstrings explaining the reasoning, edge cases handled, and any assumptions made.</w:t>
+      </w:r>
+    </w:p>
+    <w:p>
+      <w:pPr>
+        <w:spacing w:after="120"/>
+      </w:pPr>
+      <w:r>
+        <w:rPr>
+          <w:rFonts w:ascii="Arial" w:cs="Arial" w:eastAsia="Arial" w:hAnsi="Arial"/>
+          <w:sz w:val="22"/>
+          <w:szCs w:val="22"/>
+        </w:rPr>
+        <w:t xml:space="preserve">The approach is a systematic module-by-module pass: read each source file, identify functions where the name alone does not convey the full picture, and add or improve docstrings explaining the intent, parameters, return values, side effects, and any non-obvious logic. This is an incremental task that can be done one module at a time, prioritising the most complex modules first (Main.py, thread_viewer.py, document_library.py, ai_handler.py, db_manager.py). The Project Map already documents public interfaces; this enhancement fills the gap at the individual function level within the code itself.</w:t>
+      </w:r>
+    </w:p>
+    <w:p>
+      <w:pPr>
+        <w:spacing w:after="120"/>
+      </w:pPr>
+      <w:r>
+        <w:rPr>
+          <w:rFonts w:ascii="Arial" w:cs="Arial" w:eastAsia="Arial" w:hAnsi="Arial"/>
+          <w:i/>
+          <w:iCs/>
+          <w:color w:val="666666"/>
+          <w:sz w:val="22"/>
+          <w:szCs w:val="22"/>
+        </w:rPr>
+        <w:t xml:space="preserve">Moderate effort (spread over time). High long-term maintainability value. Can be done incrementally alongside other work. Slot into Phase A.</w:t>
       </w:r>
     </w:p>
     <w:p>
@@ -1981,6 +2653,122 @@
           </w:p>
         </w:tc>
       </w:tr>
+      <w:tr>
+        <w:tc>
+          <w:tcPr>
+            <w:tcW w:type="dxa" w:w="2800"/>
+            <w:tcBorders>
+              <w:top w:val="single" w:color="CCCCCC" w:sz="1"/>
+              <w:left w:val="single" w:color="CCCCCC" w:sz="1"/>
+              <w:bottom w:val="single" w:color="CCCCCC" w:sz="1"/>
+              <w:right w:val="single" w:color="CCCCCC" w:sz="1"/>
+            </w:tcBorders>
+            <w:tcMar>
+              <w:top w:type="dxa" w:w="80"/>
+              <w:left w:type="dxa" w:w="120"/>
+              <w:bottom w:type="dxa" w:w="80"/>
+              <w:right w:type="dxa" w:w="120"/>
+            </w:tcMar>
+          </w:tcPr>
+          <w:p>
+            <w:r>
+              <w:rPr>
+                <w:rFonts w:ascii="Arial" w:cs="Arial" w:eastAsia="Arial" w:hAnsi="Arial"/>
+                <w:b/>
+                <w:bCs/>
+                <w:sz w:val="20"/>
+                <w:szCs w:val="20"/>
+              </w:rPr>
+              <w:t xml:space="preserve">SQLite Database Migration</w:t>
+            </w:r>
+          </w:p>
+        </w:tc>
+        <w:tc>
+          <w:tcPr>
+            <w:tcW w:type="dxa" w:w="6560"/>
+            <w:tcBorders>
+              <w:top w:val="single" w:color="CCCCCC" w:sz="1"/>
+              <w:left w:val="single" w:color="CCCCCC" w:sz="1"/>
+              <w:bottom w:val="single" w:color="CCCCCC" w:sz="1"/>
+              <w:right w:val="single" w:color="CCCCCC" w:sz="1"/>
+            </w:tcBorders>
+            <w:tcMar>
+              <w:top w:type="dxa" w:w="80"/>
+              <w:left w:type="dxa" w:w="120"/>
+              <w:bottom w:type="dxa" w:w="80"/>
+              <w:right w:type="dxa" w:w="120"/>
+            </w:tcMar>
+          </w:tcPr>
+          <w:p>
+            <w:r>
+              <w:rPr>
+                <w:rFonts w:ascii="Arial" w:cs="Arial" w:eastAsia="Arial" w:hAnsi="Arial"/>
+                <w:sz w:val="20"/>
+                <w:szCs w:val="20"/>
+              </w:rPr>
+              <w:t xml:space="preserve">Complete migration from JSON file storage to SQLite database (db_manager.py). Seven stages covering costs, embeddings, prompts, documents, entries, conversations, processed outputs, and folder trees. All data types now read/write via SQLite with JSON as fallback/backup. Includes adapter modules (prompt_db_adapter.py, document_db_adapter.py) and feature flags for staged rollout. Lays the foundation for future Workspaces feature.</w:t>
+            </w:r>
+          </w:p>
+        </w:tc>
+      </w:tr>
+      <w:tr>
+        <w:tc>
+          <w:tcPr>
+            <w:tcW w:type="dxa" w:w="2800"/>
+            <w:tcBorders>
+              <w:top w:val="single" w:color="CCCCCC" w:sz="1"/>
+              <w:left w:val="single" w:color="CCCCCC" w:sz="1"/>
+              <w:bottom w:val="single" w:color="CCCCCC" w:sz="1"/>
+              <w:right w:val="single" w:color="CCCCCC" w:sz="1"/>
+            </w:tcBorders>
+            <w:tcMar>
+              <w:top w:type="dxa" w:w="80"/>
+              <w:left w:type="dxa" w:w="120"/>
+              <w:bottom w:type="dxa" w:w="80"/>
+              <w:right w:type="dxa" w:w="120"/>
+            </w:tcMar>
+          </w:tcPr>
+          <w:p>
+            <w:r>
+              <w:rPr>
+                <w:rFonts w:ascii="Arial" w:cs="Arial" w:eastAsia="Arial" w:hAnsi="Arial"/>
+                <w:b/>
+                <w:bCs/>
+                <w:sz w:val="20"/>
+                <w:szCs w:val="20"/>
+              </w:rPr>
+              <w:t xml:space="preserve">F1 Context Help</w:t>
+            </w:r>
+          </w:p>
+        </w:tc>
+        <w:tc>
+          <w:tcPr>
+            <w:tcW w:type="dxa" w:w="6560"/>
+            <w:tcBorders>
+              <w:top w:val="single" w:color="CCCCCC" w:sz="1"/>
+              <w:left w:val="single" w:color="CCCCCC" w:sz="1"/>
+              <w:bottom w:val="single" w:color="CCCCCC" w:sz="1"/>
+              <w:right w:val="single" w:color="CCCCCC" w:sz="1"/>
+            </w:tcBorders>
+            <w:tcMar>
+              <w:top w:type="dxa" w:w="80"/>
+              <w:left w:type="dxa" w:w="120"/>
+              <w:bottom w:type="dxa" w:w="80"/>
+              <w:right w:type="dxa" w:w="120"/>
+            </w:tcMar>
+          </w:tcPr>
+          <w:p>
+            <w:r>
+              <w:rPr>
+                <w:rFonts w:ascii="Arial" w:cs="Arial" w:eastAsia="Arial" w:hAnsi="Arial"/>
+                <w:sz w:val="20"/>
+                <w:szCs w:val="20"/>
+              </w:rPr>
+              <w:t xml:space="preserve">Context-sensitive help migrated from right-click to F1 key. Pressing F1 while hovering over any registered widget shows its help popup. Frees right-click for future context menus (export, rename, move to folder, etc.) throughout both libraries and the thread viewer. Updated context_help.py, Main.py, and help_texts.json.</w:t>
+            </w:r>
+          </w:p>
+        </w:tc>
+      </w:tr>
     </w:tbl>
     <w:p>
       <w:pPr>
@@ -2057,7 +2845,7 @@
           <w:sz w:val="22"/>
           <w:szCs w:val="22"/>
         </w:rPr>
-        <w:t xml:space="preserve">(Enhancement 1) — The tree structure is already built; adding export-to-JSON and import-with-preview is a natural extension. Low effort, immediate user value for anyone wanting to share prompts between machines or with other users.</w:t>
+        <w:t xml:space="preserve">(Enhancement 1) — The tree structure is already built; adding export-to-JSON and import-with-preview is a natural extension. Low effort, immediate user value for anyone wanting to share prompts between machines or with other users. The broader design uses a self-contained .docanalyser package (ZIP archive with manifest.json and content files) covering both prompts and documents, with export by folder/selection/all and an import dialog with destination picker and duplicate handling. Document export includes the full content, entries, and conversation threads. The InnoSetup installer should register the .docanalyser file extension (via HKCU registry entries) so that double-clicking a package in Explorer opens DocAnalyser’s import dialog directly. Main.py checks sys.argv at startup for a .docanalyser path and queues the import dialog.</w:t>
       </w:r>
     </w:p>
     <w:p>
@@ -2081,6 +2869,167 @@
           <w:szCs w:val="22"/>
         </w:rPr>
         <w:t xml:space="preserve">(Enhancement 12a) — Publish a curated models.json to the GitHub repo and wire up model_updater.py to pull it. Minimal code change, eliminates the need for a full rebuild every time a new model is released.</w:t>
+      </w:r>
+    </w:p>
+    <w:p>
+      <w:pPr>
+        <w:spacing w:after="120"/>
+      </w:pPr>
+      <w:r>
+        <w:rPr>
+          <w:rFonts w:ascii="Arial" w:cs="Arial" w:eastAsia="Arial" w:hAnsi="Arial"/>
+          <w:b/>
+          <w:bCs/>
+          <w:sz w:val="22"/>
+          <w:szCs w:val="22"/>
+        </w:rPr>
+        <w:t xml:space="preserve">3. Help Text Editor </w:t>
+      </w:r>
+      <w:r>
+        <w:rPr>
+          <w:rFonts w:ascii="Arial" w:cs="Arial" w:eastAsia="Arial" w:hAnsi="Arial"/>
+          <w:sz w:val="22"/>
+          <w:szCs w:val="22"/>
+        </w:rPr>
+        <w:t xml:space="preserve">(Enhancement 14) — Migrate help texts from help_texts.json to a SQLite table and build a standalone maintenance tool (maintenance/help_text_editor.py) with a table view, edit form, and live preview. Developer-only tool that makes maintaining context-sensitive help much faster.</w:t>
+      </w:r>
+    </w:p>
+    <w:p>
+      <w:pPr>
+        <w:spacing w:after="120"/>
+      </w:pPr>
+      <w:r>
+        <w:rPr>
+          <w:rFonts w:ascii="Arial" w:cs="Arial" w:eastAsia="Arial" w:hAnsi="Arial"/>
+          <w:b/>
+          <w:bCs/>
+          <w:sz w:val="22"/>
+          <w:szCs w:val="22"/>
+        </w:rPr>
+        <w:t xml:space="preserve">4. User-Facing Message Editor </w:t>
+      </w:r>
+      <w:r>
+        <w:rPr>
+          <w:rFonts w:ascii="Arial" w:cs="Arial" w:eastAsia="Arial" w:hAnsi="Arial"/>
+          <w:sz w:val="22"/>
+          <w:szCs w:val="22"/>
+        </w:rPr>
+        <w:t xml:space="preserve">(Enhancement 15) — Centralise all hardcoded error messages, warnings, confirmations, and status bar strings into a messages.json / SQLite table with get_message() lookups. Add a second tab to the Help Text Editor maintenance tool for searching, filtering by category, and editing messages in place. Migration is incremental — start with the most common dialogs and expand over time. Particularly valuable during beta when users report confusing messages.</w:t>
+      </w:r>
+    </w:p>
+    <w:p>
+      <w:pPr>
+        <w:spacing w:after="120"/>
+      </w:pPr>
+      <w:r>
+        <w:rPr>
+          <w:rFonts w:ascii="Arial" w:cs="Arial" w:eastAsia="Arial" w:hAnsi="Arial"/>
+          <w:b/>
+          <w:bCs/>
+          <w:sz w:val="22"/>
+          <w:szCs w:val="22"/>
+        </w:rPr>
+        <w:t xml:space="preserve">5. Settings Registry </w:t>
+      </w:r>
+      <w:r>
+        <w:rPr>
+          <w:rFonts w:ascii="Arial" w:cs="Arial" w:eastAsia="Arial" w:hAnsi="Arial"/>
+          <w:sz w:val="22"/>
+          <w:szCs w:val="22"/>
+        </w:rPr>
+        <w:t xml:space="preserve">(Enhancement 16) — Centralise all application settings into a single table (key, default, current value, data type, category, description, owning module). Add a read-only viewer tab to the maintenance tool. Makes it easy to audit what settings exist, find defaults, and track which module owns each setting.</w:t>
+      </w:r>
+    </w:p>
+    <w:p>
+      <w:pPr>
+        <w:spacing w:after="120"/>
+      </w:pPr>
+      <w:r>
+        <w:rPr>
+          <w:rFonts w:ascii="Arial" w:cs="Arial" w:eastAsia="Arial" w:hAnsi="Arial"/>
+          <w:b/>
+          <w:bCs/>
+          <w:sz w:val="22"/>
+          <w:szCs w:val="22"/>
+        </w:rPr>
+        <w:t xml:space="preserve">6. Module Dependency Map </w:t>
+      </w:r>
+      <w:r>
+        <w:rPr>
+          <w:rFonts w:ascii="Arial" w:cs="Arial" w:eastAsia="Arial" w:hAnsi="Arial"/>
+          <w:sz w:val="22"/>
+          <w:szCs w:val="22"/>
+        </w:rPr>
+        <w:t xml:space="preserve">(Enhancement 17) — Standalone script (~60–80 lines) that scans all .py files, parses import statements, and reports which modules depend on which others. Text or Mermaid diagram output. Useful before any refactoring to see downstream impact.</w:t>
+      </w:r>
+    </w:p>
+    <w:p>
+      <w:pPr>
+        <w:spacing w:after="120"/>
+      </w:pPr>
+      <w:r>
+        <w:rPr>
+          <w:rFonts w:ascii="Arial" w:cs="Arial" w:eastAsia="Arial" w:hAnsi="Arial"/>
+          <w:b/>
+          <w:bCs/>
+          <w:sz w:val="22"/>
+          <w:szCs w:val="22"/>
+        </w:rPr>
+        <w:t xml:space="preserve">7. Pre-Release Smoke Test </w:t>
+      </w:r>
+      <w:r>
+        <w:rPr>
+          <w:rFonts w:ascii="Arial" w:cs="Arial" w:eastAsia="Arial" w:hAnsi="Arial"/>
+          <w:sz w:val="22"/>
+          <w:szCs w:val="22"/>
+        </w:rPr>
+        <w:t xml:space="preserve">(Enhancement 18) — Run before building the installer. Validates: all imports resolve, all help/message keys exist, no duplicate function names, SQLite feature flags correct, version number incremented. Best built after Enhancements 14–15 so it can validate their key lookups.</w:t>
+      </w:r>
+    </w:p>
+    <w:p>
+      <w:pPr>
+        <w:spacing w:after="120"/>
+      </w:pPr>
+      <w:r>
+        <w:rPr>
+          <w:rFonts w:ascii="Arial" w:cs="Arial" w:eastAsia="Arial" w:hAnsi="Arial"/>
+          <w:b/>
+          <w:bCs/>
+          <w:sz w:val="22"/>
+          <w:szCs w:val="22"/>
+        </w:rPr>
+        <w:t xml:space="preserve">8. Config/Constants Audit </w:t>
+      </w:r>
+      <w:r>
+        <w:rPr>
+          <w:rFonts w:ascii="Arial" w:cs="Arial" w:eastAsia="Arial" w:hAnsi="Arial"/>
+          <w:sz w:val="22"/>
+          <w:szCs w:val="22"/>
+        </w:rPr>
+        <w:t xml:space="preserve">(Enhancement 19) — One-off scan tool that finds magic numbers and hardcoded paths across all source files. Reports values with file and line number for review. Run occasionally as housekeeping; results feed into the Settings Registry (Enhancement 16).</w:t>
+      </w:r>
+    </w:p>
+    <w:p>
+      <w:pPr>
+        <w:spacing w:after="120"/>
+      </w:pPr>
+      <w:r>
+        <w:rPr>
+          <w:rFonts w:ascii="Arial" w:cs="Arial" w:eastAsia="Arial" w:hAnsi="Arial"/>
+          <w:b/>
+          <w:bCs/>
+          <w:sz w:val="22"/>
+          <w:szCs w:val="22"/>
+        </w:rPr>
+        <w:t xml:space="preserve">9. Function-Level Documentation </w:t>
+      </w:r>
+      <w:r>
+        <w:rPr>
+          <w:rFonts w:ascii="Arial" w:cs="Arial" w:eastAsia="Arial" w:hAnsi="Arial"/>
+          <w:sz w:val="22"/>
+          <w:szCs w:val="22"/>
+        </w:rPr>
+        <w:t xml:space="preserve">(Enhancement 20) — Systematic module-by-module pass to add or improve docstrings on non-obvious functions, explaining intent, parameters, return values, side effects, and reasoning. Prioritise the most complex modules first (Main.py, thread_viewer.py, document_library.py, ai_handler.py, db_manager.py). Incremental — can be done one module at a time alongside other work.</w:t>
       </w:r>
     </w:p>
     <w:p>
@@ -2306,6 +3255,29 @@
           <w:szCs w:val="22"/>
         </w:rPr>
         <w:t xml:space="preserve"> — the current engine lineup (faster-whisper local, AssemblyAI cloud, OpenAI Whisper cloud) covers the ground well. Add if a specific need arises: high-volume transcription where speed or cost matters, or if users request it. Estimated effort: ~50–60 lines in audio_handler.py, plus a settings UI entry. Low complexity, low risk.</w:t>
+      </w:r>
+    </w:p>
+    <w:p>
+      <w:pPr>
+        <w:spacing w:after="120"/>
+      </w:pPr>
+      <w:r>
+        <w:rPr>
+          <w:rFonts w:ascii="Arial" w:cs="Arial" w:eastAsia="Arial" w:hAnsi="Arial"/>
+          <w:b/>
+          <w:bCs/>
+          <w:sz w:val="22"/>
+          <w:szCs w:val="22"/>
+        </w:rPr>
+        <w:t xml:space="preserve">10. Workspaces </w:t>
+      </w:r>
+      <w:r>
+        <w:rPr>
+          <w:rFonts w:ascii="Arial" w:cs="Arial" w:eastAsia="Arial" w:hAnsi="Arial"/>
+          <w:sz w:val="22"/>
+          <w:szCs w:val="22"/>
+        </w:rPr>
+        <w:t xml:space="preserve">(Enhancement 13) — Project-level partitioning of documents, conversations, and costs. The SQLite database already has workspace_id columns pre-wired in the folders and cost_log tables. Prompts are global by default with optional multi-workspace scoping via a junction table; documents follow the same many-to-many pattern. Moderate effort, primarily UI and filtering logic. Value increases as the document library grows.</w:t>
       </w:r>
     </w:p>
     <w:p>
@@ -3143,6 +4115,93 @@
                 <w:szCs w:val="20"/>
               </w:rPr>
               <w:t xml:space="preserve">Already built and working</w:t>
+            </w:r>
+          </w:p>
+        </w:tc>
+      </w:tr>
+      <w:tr>
+        <w:tc>
+          <w:tcPr>
+            <w:tcW w:type="dxa" w:w="2200"/>
+            <w:tcBorders>
+              <w:top w:val="single" w:color="CCCCCC" w:sz="1"/>
+              <w:left w:val="single" w:color="CCCCCC" w:sz="1"/>
+              <w:bottom w:val="single" w:color="CCCCCC" w:sz="1"/>
+              <w:right w:val="single" w:color="CCCCCC" w:sz="1"/>
+            </w:tcBorders>
+            <w:tcMar>
+              <w:top w:type="dxa" w:w="80"/>
+              <w:left w:type="dxa" w:w="120"/>
+              <w:bottom w:type="dxa" w:w="80"/>
+              <w:right w:type="dxa" w:w="120"/>
+            </w:tcMar>
+          </w:tcPr>
+          <w:p>
+            <w:r>
+              <w:rPr>
+                <w:rFonts w:ascii="Arial" w:cs="Arial" w:eastAsia="Arial" w:hAnsi="Arial"/>
+                <w:b/>
+                <w:bCs/>
+                <w:sz w:val="20"/>
+                <w:szCs w:val="20"/>
+              </w:rPr>
+              <w:t xml:space="preserve">Storage backend</w:t>
+            </w:r>
+          </w:p>
+        </w:tc>
+        <w:tc>
+          <w:tcPr>
+            <w:tcW w:type="dxa" w:w="3200"/>
+            <w:tcBorders>
+              <w:top w:val="single" w:color="CCCCCC" w:sz="1"/>
+              <w:left w:val="single" w:color="CCCCCC" w:sz="1"/>
+              <w:bottom w:val="single" w:color="CCCCCC" w:sz="1"/>
+              <w:right w:val="single" w:color="CCCCCC" w:sz="1"/>
+            </w:tcBorders>
+            <w:shd w:fill="F2F2F2" w:val="clear"/>
+            <w:tcMar>
+              <w:top w:type="dxa" w:w="80"/>
+              <w:left w:type="dxa" w:w="120"/>
+              <w:bottom w:type="dxa" w:w="80"/>
+              <w:right w:type="dxa" w:w="120"/>
+            </w:tcMar>
+          </w:tcPr>
+          <w:p>
+            <w:r>
+              <w:rPr>
+                <w:rFonts w:ascii="Arial" w:cs="Arial" w:eastAsia="Arial" w:hAnsi="Arial"/>
+                <w:sz w:val="20"/>
+                <w:szCs w:val="20"/>
+              </w:rPr>
+              <w:t xml:space="preserve">JSON flat files for all data</w:t>
+            </w:r>
+          </w:p>
+        </w:tc>
+        <w:tc>
+          <w:tcPr>
+            <w:tcW w:type="dxa" w:w="3960"/>
+            <w:tcBorders>
+              <w:top w:val="single" w:color="CCCCCC" w:sz="1"/>
+              <w:left w:val="single" w:color="CCCCCC" w:sz="1"/>
+              <w:bottom w:val="single" w:color="CCCCCC" w:sz="1"/>
+              <w:right w:val="single" w:color="CCCCCC" w:sz="1"/>
+            </w:tcBorders>
+            <w:shd w:fill="F2F2F2" w:val="clear"/>
+            <w:tcMar>
+              <w:top w:type="dxa" w:w="80"/>
+              <w:left w:type="dxa" w:w="120"/>
+              <w:bottom w:type="dxa" w:w="80"/>
+              <w:right w:type="dxa" w:w="120"/>
+            </w:tcMar>
+          </w:tcPr>
+          <w:p>
+            <w:r>
+              <w:rPr>
+                <w:rFonts w:ascii="Arial" w:cs="Arial" w:eastAsia="Arial" w:hAnsi="Arial"/>
+                <w:sz w:val="20"/>
+                <w:szCs w:val="20"/>
+              </w:rPr>
+              <w:t xml:space="preserve">SQLite database (db_manager.py) for all data types. JSON retained as backup.</w:t>
             </w:r>
           </w:p>
         </w:tc>

</xml_diff>